<commit_message>
Create featured engineerng dataset, add plots for analysing model performance on various datasets
</commit_message>
<xml_diff>
--- a/reports/IT5022-ML-PROJECT-REPORT.docx
+++ b/reports/IT5022-ML-PROJECT-REPORT.docx
@@ -272,7 +272,21 @@
         <w:rPr>
           <w:rFonts w:ascii="Times New Roman" w:hAnsi="Times New Roman" w:cs="Times New Roman"/>
         </w:rPr>
-        <w:t>The dataset focuses on predicting whether a credit card client will default on their payment in the next month. It was originally collected by researchers in Taiwan and includes demographic, financial, and behavioral data for 30,000 clients</w:t>
+        <w:t xml:space="preserve">The </w:t>
+      </w:r>
+      <w:proofErr w:type="gramStart"/>
+      <w:r>
+        <w:rPr>
+          <w:rFonts w:ascii="Times New Roman" w:hAnsi="Times New Roman" w:cs="Times New Roman"/>
+        </w:rPr>
+        <w:t>dataset</w:t>
+      </w:r>
+      <w:proofErr w:type="gramEnd"/>
+      <w:r>
+        <w:rPr>
+          <w:rFonts w:ascii="Times New Roman" w:hAnsi="Times New Roman" w:cs="Times New Roman"/>
+        </w:rPr>
+        <w:t xml:space="preserve"> focuses on predicting whether a credit card client will default on their payment in the next month. It was originally collected by researchers in Taiwan and includes demographic, financial, and behavioral data for 30,000 clients</w:t>
       </w:r>
     </w:p>
     <w:p>
@@ -625,12 +639,30 @@
           <w:rFonts w:ascii="Times New Roman" w:hAnsi="Times New Roman" w:cs="Times New Roman"/>
         </w:rPr>
       </w:pPr>
-      <w:r>
-        <w:rPr>
-          <w:rFonts w:ascii="Times New Roman" w:hAnsi="Times New Roman" w:cs="Times New Roman"/>
-        </w:rPr>
-        <w:t>default.payment.next.month</w:t>
-      </w:r>
+      <w:proofErr w:type="spellStart"/>
+      <w:proofErr w:type="gramStart"/>
+      <w:r>
+        <w:rPr>
+          <w:rFonts w:ascii="Times New Roman" w:hAnsi="Times New Roman" w:cs="Times New Roman"/>
+        </w:rPr>
+        <w:t>default.payment</w:t>
+      </w:r>
+      <w:proofErr w:type="gramEnd"/>
+      <w:r>
+        <w:rPr>
+          <w:rFonts w:ascii="Times New Roman" w:hAnsi="Times New Roman" w:cs="Times New Roman"/>
+        </w:rPr>
+        <w:t>.</w:t>
+      </w:r>
+      <w:proofErr w:type="gramStart"/>
+      <w:r>
+        <w:rPr>
+          <w:rFonts w:ascii="Times New Roman" w:hAnsi="Times New Roman" w:cs="Times New Roman"/>
+        </w:rPr>
+        <w:t>next.month</w:t>
+      </w:r>
+      <w:proofErr w:type="spellEnd"/>
+      <w:proofErr w:type="gramEnd"/>
       <w:r>
         <w:rPr>
           <w:rFonts w:ascii="Times New Roman" w:hAnsi="Times New Roman" w:cs="Times New Roman"/>
@@ -678,7 +710,21 @@
         <w:rPr>
           <w:rFonts w:ascii="Times New Roman" w:hAnsi="Times New Roman" w:cs="Times New Roman"/>
         </w:rPr>
-        <w:t>Time-Specific: The data reflects a specific time period and economic context</w:t>
+        <w:t xml:space="preserve">Time-Specific: The data reflects a specific </w:t>
+      </w:r>
+      <w:proofErr w:type="gramStart"/>
+      <w:r>
+        <w:rPr>
+          <w:rFonts w:ascii="Times New Roman" w:hAnsi="Times New Roman" w:cs="Times New Roman"/>
+        </w:rPr>
+        <w:t>time period</w:t>
+      </w:r>
+      <w:proofErr w:type="gramEnd"/>
+      <w:r>
+        <w:rPr>
+          <w:rFonts w:ascii="Times New Roman" w:hAnsi="Times New Roman" w:cs="Times New Roman"/>
+        </w:rPr>
+        <w:t xml:space="preserve"> and economic context</w:t>
       </w:r>
     </w:p>
     <w:p>
@@ -820,6 +866,7 @@
           <w:rFonts w:ascii="Times New Roman" w:hAnsi="Times New Roman" w:cs="Times New Roman"/>
           <w:b/>
           <w:bCs/>
+          <w:highlight w:val="yellow"/>
         </w:rPr>
         <w:t>Results</w:t>
       </w:r>
@@ -828,6 +875,7 @@
           <w:rFonts w:ascii="Times New Roman" w:hAnsi="Times New Roman" w:cs="Times New Roman"/>
           <w:b/>
           <w:bCs/>
+          <w:highlight w:val="yellow"/>
         </w:rPr>
         <w:t xml:space="preserve"> &amp; Discussions</w:t>
       </w:r>
@@ -1691,6 +1739,7 @@
                 <w:bCs w:val="0"/>
               </w:rPr>
             </w:pPr>
+            <w:proofErr w:type="spellStart"/>
             <w:r>
               <w:rPr>
                 <w:rFonts w:ascii="Times New Roman" w:hAnsi="Times New Roman" w:cs="Times New Roman"/>
@@ -1699,6 +1748,7 @@
               </w:rPr>
               <w:t>n_estimators</w:t>
             </w:r>
+            <w:proofErr w:type="spellEnd"/>
           </w:p>
         </w:tc>
         <w:tc>
@@ -1714,6 +1764,7 @@
                 <w:bCs w:val="0"/>
               </w:rPr>
             </w:pPr>
+            <w:proofErr w:type="spellStart"/>
             <w:r>
               <w:rPr>
                 <w:rFonts w:ascii="Times New Roman" w:hAnsi="Times New Roman" w:cs="Times New Roman"/>
@@ -1722,6 +1773,7 @@
               </w:rPr>
               <w:t>max_depth</w:t>
             </w:r>
+            <w:proofErr w:type="spellEnd"/>
           </w:p>
         </w:tc>
         <w:tc>
@@ -1737,6 +1789,7 @@
                 <w:bCs w:val="0"/>
               </w:rPr>
             </w:pPr>
+            <w:proofErr w:type="spellStart"/>
             <w:r>
               <w:rPr>
                 <w:rFonts w:ascii="Times New Roman" w:hAnsi="Times New Roman" w:cs="Times New Roman"/>
@@ -1745,6 +1798,7 @@
               </w:rPr>
               <w:t>min_samples_split</w:t>
             </w:r>
+            <w:proofErr w:type="spellEnd"/>
           </w:p>
         </w:tc>
         <w:tc>
@@ -4787,6 +4841,7 @@
   <w:style w:type="character" w:default="1" w:styleId="DefaultParagraphFont">
     <w:name w:val="Default Paragraph Font"/>
     <w:uiPriority w:val="1"/>
+    <w:semiHidden/>
     <w:unhideWhenUsed/>
   </w:style>
   <w:style w:type="table" w:default="1" w:styleId="TableNormal">

</xml_diff>